<commit_message>
Auto-compile: Additive update to The Pathway to the Spires (Validated via Pytest)
</commit_message>
<xml_diff>
--- a/The_Pathway_to_the_Spires.docx
+++ b/The_Pathway_to_the_Spires.docx
@@ -2424,6 +2424,396 @@
     <w:p>
       <w:r>
         <w:br w:type="page"/>
+      </w:r>
+    </w:p>
+    <w:p>
+      <w:pPr>
+        <w:spacing w:before="400" w:after="200"/>
+      </w:pPr>
+      <w:r>
+        <w:rPr>
+          <w:rFonts w:ascii="Georgia" w:hAnsi="Georgia"/>
+          <w:b/>
+          <w:color w:val="1B365D"/>
+          <w:sz w:val="44"/>
+        </w:rPr>
+        <w:t>Appendix: Living Journal &amp; Progress Log</w:t>
+      </w:r>
+    </w:p>
+    <w:p>
+      <w:pPr>
+        <w:spacing w:before="280" w:after="80"/>
+      </w:pPr>
+      <w:r>
+        <w:rPr>
+          <w:rFonts w:ascii="Georgia" w:hAnsi="Georgia"/>
+          <w:b/>
+          <w:color w:val="505050"/>
+          <w:sz w:val="28"/>
+        </w:rPr>
+        <w:t>Entry Date: 2026-06-24</w:t>
+      </w:r>
+    </w:p>
+    <w:p>
+      <w:pPr>
+        <w:spacing w:after="80" w:line="276" w:lineRule="auto"/>
+      </w:pPr>
+      <w:r>
+        <w:rPr>
+          <w:rFonts w:ascii="Calibri" w:hAnsi="Calibri"/>
+          <w:sz w:val="21"/>
+        </w:rPr>
+        <w:t># OpenClaw Daily Memories - June 24, 2026</w:t>
+      </w:r>
+    </w:p>
+    <w:p>
+      <w:pPr>
+        <w:spacing w:after="80" w:line="276" w:lineRule="auto"/>
+      </w:pPr>
+      <w:r>
+        <w:rPr>
+          <w:rFonts w:ascii="Calibri" w:hAnsi="Calibri"/>
+          <w:sz w:val="21"/>
+        </w:rPr>
+        <w:t>## 🧠 Session Durable Memories (June 24, 2026 - 11:27 BST)</w:t>
+      </w:r>
+    </w:p>
+    <w:p>
+      <w:pPr>
+        <w:spacing w:after="80" w:line="276" w:lineRule="auto"/>
+      </w:pPr>
+      <w:r>
+        <w:rPr>
+          <w:rFonts w:ascii="Calibri" w:hAnsi="Calibri"/>
+          <w:sz w:val="21"/>
+        </w:rPr>
+        <w:t>### 🛠️ Infrastructure &amp; Configuration Normalization</w:t>
+      </w:r>
+    </w:p>
+    <w:p>
+      <w:pPr>
+        <w:spacing w:after="80" w:line="276" w:lineRule="auto"/>
+      </w:pPr>
+      <w:r>
+        <w:rPr>
+          <w:rFonts w:ascii="Calibri" w:hAnsi="Calibri"/>
+          <w:sz w:val="21"/>
+        </w:rPr>
+        <w:t>1. **Pytest Isolation Fixed:** Created a global `/home/yang/.openclaw/workspace/pytest.ini` with `norecursedirs = claw_brain_backup` to prevent duplicate test-file discovery within backup folders. This resolved import file mismatches and successfully restored the test suite (11/11 tests passing).</w:t>
+      </w:r>
+    </w:p>
+    <w:p>
+      <w:pPr>
+        <w:spacing w:after="80" w:line="276" w:lineRule="auto"/>
+      </w:pPr>
+      <w:r>
+        <w:rPr>
+          <w:rFonts w:ascii="Calibri" w:hAnsi="Calibri"/>
+          <w:sz w:val="21"/>
+        </w:rPr>
+        <w:t>2. **Memory Search Blockers Eliminated:** Resolved `openclaw doctor` warnings by explicitly disabling memory search indexing (`agents.defaults.memorySearch.enabled false`) since the host primarily relies on Google/Gemini and does not use OpenAI API keys.</w:t>
+      </w:r>
+    </w:p>
+    <w:p>
+      <w:pPr>
+        <w:spacing w:after="80" w:line="276" w:lineRule="auto"/>
+      </w:pPr>
+      <w:r>
+        <w:rPr>
+          <w:rFonts w:ascii="Calibri" w:hAnsi="Calibri"/>
+          <w:sz w:val="21"/>
+        </w:rPr>
+        <w:t>3. **Cron Store Normalization:** Patched legacy syntax in background cron task definitions and executed `openclaw doctor --fix` to normalize background cron payloads into canonical `kind: "command"` SQLite structures.</w:t>
+      </w:r>
+    </w:p>
+    <w:p>
+      <w:pPr>
+        <w:spacing w:after="80" w:line="276" w:lineRule="auto"/>
+      </w:pPr>
+      <w:r>
+        <w:rPr>
+          <w:rFonts w:ascii="Calibri" w:hAnsi="Calibri"/>
+          <w:sz w:val="21"/>
+        </w:rPr>
+        <w:t>4. **Monthly Schedule Migration:** Shifted the `clawbot-brain-upgrader` task (`cd63e9c0`) from daily runs to a monthly cron schedule (`0 0 1 * *`) to save API tokens and match editorial review cycles.</w:t>
+      </w:r>
+    </w:p>
+    <w:p>
+      <w:pPr>
+        <w:spacing w:after="80" w:line="276" w:lineRule="auto"/>
+      </w:pPr>
+      <w:r>
+        <w:rPr>
+          <w:rFonts w:ascii="Calibri" w:hAnsi="Calibri"/>
+          <w:sz w:val="21"/>
+        </w:rPr>
+        <w:t>### 📚 Custom Book Builder &amp; Companion Web-App Refinements</w:t>
+      </w:r>
+    </w:p>
+    <w:p>
+      <w:pPr>
+        <w:spacing w:after="80" w:line="276" w:lineRule="auto"/>
+      </w:pPr>
+      <w:r>
+        <w:rPr>
+          <w:rFonts w:ascii="Calibri" w:hAnsi="Calibri"/>
+          <w:sz w:val="21"/>
+        </w:rPr>
+        <w:t>1. **Project Re-Branded:** Renamed the book and website companion from "The Pathway to the Spires" to **"A Pathway to Success"**, reflecting an expanded focus on the elite UK G5 (Oxford, Cambridge, Imperial, LSE, and UCL).</w:t>
+      </w:r>
+    </w:p>
+    <w:p>
+      <w:pPr>
+        <w:spacing w:after="80" w:line="276" w:lineRule="auto"/>
+      </w:pPr>
+      <w:r>
+        <w:rPr>
+          <w:rFonts w:ascii="Calibri" w:hAnsi="Calibri"/>
+          <w:sz w:val="21"/>
+        </w:rPr>
+        <w:t>2. **Decoupled Architecture:** Migrated hardcoded text content from React's `App.jsx` into a clean, decoupled JSON data store (`data.json`).</w:t>
+      </w:r>
+    </w:p>
+    <w:p>
+      <w:pPr>
+        <w:spacing w:after="80" w:line="276" w:lineRule="auto"/>
+      </w:pPr>
+      <w:r>
+        <w:rPr>
+          <w:rFonts w:ascii="Calibri" w:hAnsi="Calibri"/>
+          <w:sz w:val="21"/>
+        </w:rPr>
+        <w:t>3. **High-Fidelity Interface Features:**</w:t>
+      </w:r>
+    </w:p>
+    <w:p>
+      <w:pPr>
+        <w:spacing w:after="80" w:line="276" w:lineRule="auto"/>
+      </w:pPr>
+      <w:r>
+        <w:rPr>
+          <w:rFonts w:ascii="Calibri" w:hAnsi="Calibri"/>
+          <w:sz w:val="21"/>
+        </w:rPr>
+        <w:t>* Incorporated a client-side full-text corpus search bar.</w:t>
+      </w:r>
+    </w:p>
+    <w:p>
+      <w:pPr>
+        <w:spacing w:after="80" w:line="276" w:lineRule="auto"/>
+      </w:pPr>
+      <w:r>
+        <w:rPr>
+          <w:rFonts w:ascii="Calibri" w:hAnsi="Calibri"/>
+          <w:sz w:val="21"/>
+        </w:rPr>
+        <w:t>* Built interactive mindset quote anchors.</w:t>
+      </w:r>
+    </w:p>
+    <w:p>
+      <w:pPr>
+        <w:spacing w:after="80" w:line="276" w:lineRule="auto"/>
+      </w:pPr>
+      <w:r>
+        <w:rPr>
+          <w:rFonts w:ascii="Calibri" w:hAnsi="Calibri"/>
+          <w:sz w:val="21"/>
+        </w:rPr>
+        <w:t>* Added interactive, chapter-specific metacognitive progress checklists.</w:t>
+      </w:r>
+    </w:p>
+    <w:p>
+      <w:pPr>
+        <w:spacing w:after="80" w:line="276" w:lineRule="auto"/>
+      </w:pPr>
+      <w:r>
+        <w:rPr>
+          <w:rFonts w:ascii="Calibri" w:hAnsi="Calibri"/>
+          <w:sz w:val="21"/>
+        </w:rPr>
+        <w:t>* Integrated G5 admissions advice and verified links (all programmatically fact-checked and confirmed `2020 OK` on-network).</w:t>
+      </w:r>
+    </w:p>
+    <w:p>
+      <w:pPr>
+        <w:spacing w:after="80" w:line="276" w:lineRule="auto"/>
+      </w:pPr>
+      <w:r>
+        <w:rPr>
+          <w:rFonts w:ascii="Calibri" w:hAnsi="Calibri"/>
+          <w:sz w:val="21"/>
+        </w:rPr>
+        <w:t>4. **Additive Generation Pipeline:** Upgraded `modular_book_builder.py` to support additive generation. It loads previous progress on boot and selectively generates only missing or modified sections to save local GPU and API resources.</w:t>
+      </w:r>
+    </w:p>
+    <w:p>
+      <w:pPr>
+        <w:spacing w:after="80" w:line="276" w:lineRule="auto"/>
+      </w:pPr>
+      <w:r>
+        <w:rPr>
+          <w:rFonts w:ascii="Calibri" w:hAnsi="Calibri"/>
+          <w:sz w:val="21"/>
+        </w:rPr>
+        <w:t>5. **Git Safety CI/CD Gates:** Added pre-push validation inside the Python pipeline. If local `pytest` suites fail, the compiler halts compile-and-stage steps and blocks all Git commits/pushes, maintaining zero production downtime on GitHub.</w:t>
+      </w:r>
+    </w:p>
+    <w:p>
+      <w:pPr>
+        <w:spacing w:after="80" w:line="276" w:lineRule="auto"/>
+      </w:pPr>
+      <w:r>
+        <w:rPr>
+          <w:rFonts w:ascii="Calibri" w:hAnsi="Calibri"/>
+          <w:sz w:val="21"/>
+        </w:rPr>
+        <w:t>6. **Cloud Run Packaging:** Created root-level multi-stage `Dockerfile` and `.gcloudignore` files to allow seamless parent-context GCP Cloud Build runs directly from the repository root `/home/yang/.openclaw/workspace/oxbridge_guide`.</w:t>
+      </w:r>
+    </w:p>
+    <w:p>
+      <w:pPr>
+        <w:spacing w:after="80" w:line="276" w:lineRule="auto"/>
+      </w:pPr>
+      <w:r>
+        <w:rPr>
+          <w:rFonts w:ascii="Calibri" w:hAnsi="Calibri"/>
+          <w:sz w:val="21"/>
+        </w:rPr>
+        <w:t>7. **Repository Initialized:** Set up an isolated Git repository under `/oxbridge_guide/` and successfully pushed all 28 assets to GitHub: `https://github.com/pixjobs/the-pathway-to-the-spires`.</w:t>
+      </w:r>
+    </w:p>
+    <w:p>
+      <w:pPr>
+        <w:spacing w:before="280" w:after="80"/>
+      </w:pPr>
+      <w:r>
+        <w:rPr>
+          <w:rFonts w:ascii="Georgia" w:hAnsi="Georgia"/>
+          <w:b/>
+          <w:color w:val="505050"/>
+          <w:sz w:val="28"/>
+        </w:rPr>
+        <w:t>Entry Date: 2026-06-23</w:t>
+      </w:r>
+    </w:p>
+    <w:p>
+      <w:pPr>
+        <w:spacing w:after="80" w:line="276" w:lineRule="auto"/>
+      </w:pPr>
+      <w:r>
+        <w:rPr>
+          <w:rFonts w:ascii="Calibri" w:hAnsi="Calibri"/>
+          <w:sz w:val="21"/>
+        </w:rPr>
+        <w:t># OpenClaw Daily Memories - June 23, 2026</w:t>
+      </w:r>
+    </w:p>
+    <w:p>
+      <w:pPr>
+        <w:spacing w:after="80" w:line="276" w:lineRule="auto"/>
+      </w:pPr>
+      <w:r>
+        <w:rPr>
+          <w:rFonts w:ascii="Calibri" w:hAnsi="Calibri"/>
+          <w:sz w:val="21"/>
+        </w:rPr>
+        <w:t>## 🧠 Session Durable Memories (June 23, 2026 - 20:54 BST)</w:t>
+      </w:r>
+    </w:p>
+    <w:p>
+      <w:pPr>
+        <w:spacing w:after="80" w:line="276" w:lineRule="auto"/>
+      </w:pPr>
+      <w:r>
+        <w:rPr>
+          <w:rFonts w:ascii="Calibri" w:hAnsi="Calibri"/>
+          <w:sz w:val="21"/>
+        </w:rPr>
+        <w:t>### 🛠️ Systems &amp; Infrastructure Fixes</w:t>
+      </w:r>
+    </w:p>
+    <w:p>
+      <w:pPr>
+        <w:spacing w:after="80" w:line="276" w:lineRule="auto"/>
+      </w:pPr>
+      <w:r>
+        <w:rPr>
+          <w:rFonts w:ascii="Calibri" w:hAnsi="Calibri"/>
+          <w:sz w:val="21"/>
+        </w:rPr>
+        <w:t>1. **Transcoder Binaries Added:** Downloaded static Linux 64-bit releases of `ffmpeg` and `ffprobe` to `/home/yang/bin` and updated OpenClaw's standard search directories in `resolve-system-bin-DU3kFLwG.js` to ensure secure path resolution.</w:t>
+      </w:r>
+    </w:p>
+    <w:p>
+      <w:pPr>
+        <w:spacing w:after="80" w:line="276" w:lineRule="auto"/>
+      </w:pPr>
+      <w:r>
+        <w:rPr>
+          <w:rFonts w:ascii="Calibri" w:hAnsi="Calibri"/>
+          <w:sz w:val="21"/>
+        </w:rPr>
+        <w:t>2. **WeChat Outbound TTS Format:** Confirmed WeChat does not support native playable voice note objects, so outbound TTS is delivered as downloadable `.wav` file attachments.</w:t>
+      </w:r>
+    </w:p>
+    <w:p>
+      <w:pPr>
+        <w:spacing w:after="80" w:line="276" w:lineRule="auto"/>
+      </w:pPr>
+      <w:r>
+        <w:rPr>
+          <w:rFonts w:ascii="Calibri" w:hAnsi="Calibri"/>
+          <w:sz w:val="21"/>
+        </w:rPr>
+        <w:t>3. **Google Gemini TTS Model Resolution:** Resolved a Google API limitation where the standard text model (`gemini-flash-latest`) fails to return audio data under `"AUDIO"` modalities. Switched the TTS configuration in `openclaw.json` to use Google's specialized model **`gemini-3.1-flash-tts-preview`**, which works perfectly.</w:t>
+      </w:r>
+    </w:p>
+    <w:p>
+      <w:pPr>
+        <w:spacing w:after="80" w:line="276" w:lineRule="auto"/>
+      </w:pPr>
+      <w:r>
+        <w:rPr>
+          <w:rFonts w:ascii="Calibri" w:hAnsi="Calibri"/>
+          <w:sz w:val="21"/>
+        </w:rPr>
+        <w:t>### 🧪 Coding Gym &amp; Custom Developments</w:t>
+      </w:r>
+    </w:p>
+    <w:p>
+      <w:pPr>
+        <w:spacing w:after="80" w:line="276" w:lineRule="auto"/>
+      </w:pPr>
+      <w:r>
+        <w:rPr>
+          <w:rFonts w:ascii="Calibri" w:hAnsi="Calibri"/>
+          <w:sz w:val="21"/>
+        </w:rPr>
+        <w:t>1. **Level 1 Holding Block:** Created a thread-safe JSON caching class with TTL-based expiration in `blocks/json_cache.py` and successfully verified it with a pytest suite in `tests/test_json_cache.py`.</w:t>
+      </w:r>
+    </w:p>
+    <w:p>
+      <w:pPr>
+        <w:spacing w:after="80" w:line="276" w:lineRule="auto"/>
+      </w:pPr>
+      <w:r>
+        <w:rPr>
+          <w:rFonts w:ascii="Calibri" w:hAnsi="Calibri"/>
+          <w:sz w:val="21"/>
+        </w:rPr>
+        <w:t>2. **Developer Corpus Auditor:** Developed a script `yacy_corpus_audit.py` that crawls the local YaCy search engine (`192.168.50.190:8090`) and uses the local DGX Spark model (`google/gemma-4-26B-A4B-it`) to audit the completeness of our local developer reference library.</w:t>
+      </w:r>
+    </w:p>
+    <w:p>
+      <w:pPr>
+        <w:spacing w:after="80" w:line="276" w:lineRule="auto"/>
+      </w:pPr>
+      <w:r>
+        <w:rPr>
+          <w:rFonts w:ascii="Calibri" w:hAnsi="Calibri"/>
+          <w:sz w:val="21"/>
+        </w:rPr>
+        <w:t>3. **Portable Brain Backup:** Built `backup_brain.py` to securely scrub sensitive API keys and gateway tokens from `openclaw.json` and compile a clean, portable repository inside `claw_brain_backup/` to share with friends or push to GitHub.</w:t>
       </w:r>
     </w:p>
     <w:sectPr>

</xml_diff>